<commit_message>
Adição do diagrama de classe na documentação
</commit_message>
<xml_diff>
--- a/Contexto/Horus Monitoring v3.docx
+++ b/Contexto/Horus Monitoring v3.docx
@@ -298,7 +298,7 @@
           <w:r>
             <w:fldChar w:fldCharType="separate"/>
           </w:r>
-          <w:hyperlink w:anchor="_Toc227058594" w:history="1">
+          <w:hyperlink w:anchor="_Toc230628509" w:history="1">
             <w:r>
               <w:rPr>
                 <w:rStyle w:val="Hyperlink"/>
@@ -325,7 +325,7 @@
                 <w:noProof/>
                 <w:webHidden/>
               </w:rPr>
-              <w:instrText xml:space="preserve"> PAGEREF _Toc227058594 \h </w:instrText>
+              <w:instrText xml:space="preserve"> PAGEREF _Toc230628509 \h </w:instrText>
             </w:r>
             <w:r>
               <w:rPr>
@@ -345,7 +345,7 @@
                 <w:noProof/>
                 <w:webHidden/>
               </w:rPr>
-              <w:t>4</w:t>
+              <w:t>3</w:t>
             </w:r>
             <w:r>
               <w:rPr>
@@ -369,7 +369,7 @@
               <w:lang w:eastAsia="pt-BR"/>
             </w:rPr>
           </w:pPr>
-          <w:hyperlink w:anchor="_Toc227058595" w:history="1">
+          <w:hyperlink w:anchor="_Toc230628510" w:history="1">
             <w:r>
               <w:rPr>
                 <w:rStyle w:val="Hyperlink"/>
@@ -411,7 +411,7 @@
                 <w:noProof/>
                 <w:webHidden/>
               </w:rPr>
-              <w:instrText xml:space="preserve"> PAGEREF _Toc227058595 \h </w:instrText>
+              <w:instrText xml:space="preserve"> PAGEREF _Toc230628510 \h </w:instrText>
             </w:r>
             <w:r>
               <w:rPr>
@@ -431,7 +431,7 @@
                 <w:noProof/>
                 <w:webHidden/>
               </w:rPr>
-              <w:t>5</w:t>
+              <w:t>4</w:t>
             </w:r>
             <w:r>
               <w:rPr>
@@ -455,7 +455,7 @@
               <w:lang w:eastAsia="pt-BR"/>
             </w:rPr>
           </w:pPr>
-          <w:hyperlink w:anchor="_Toc227058596" w:history="1">
+          <w:hyperlink w:anchor="_Toc230628511" w:history="1">
             <w:r>
               <w:rPr>
                 <w:rStyle w:val="Hyperlink"/>
@@ -497,7 +497,7 @@
                 <w:noProof/>
                 <w:webHidden/>
               </w:rPr>
-              <w:instrText xml:space="preserve"> PAGEREF _Toc227058596 \h </w:instrText>
+              <w:instrText xml:space="preserve"> PAGEREF _Toc230628511 \h </w:instrText>
             </w:r>
             <w:r>
               <w:rPr>
@@ -517,7 +517,7 @@
                 <w:noProof/>
                 <w:webHidden/>
               </w:rPr>
-              <w:t>6</w:t>
+              <w:t>5</w:t>
             </w:r>
             <w:r>
               <w:rPr>
@@ -541,7 +541,7 @@
               <w:lang w:eastAsia="pt-BR"/>
             </w:rPr>
           </w:pPr>
-          <w:hyperlink w:anchor="_Toc227058597" w:history="1">
+          <w:hyperlink w:anchor="_Toc230628512" w:history="1">
             <w:r>
               <w:rPr>
                 <w:rStyle w:val="Hyperlink"/>
@@ -583,7 +583,7 @@
                 <w:noProof/>
                 <w:webHidden/>
               </w:rPr>
-              <w:instrText xml:space="preserve"> PAGEREF _Toc227058597 \h </w:instrText>
+              <w:instrText xml:space="preserve"> PAGEREF _Toc230628512 \h </w:instrText>
             </w:r>
             <w:r>
               <w:rPr>
@@ -603,7 +603,7 @@
                 <w:noProof/>
                 <w:webHidden/>
               </w:rPr>
-              <w:t>6</w:t>
+              <w:t>5</w:t>
             </w:r>
             <w:r>
               <w:rPr>
@@ -627,7 +627,7 @@
               <w:lang w:eastAsia="pt-BR"/>
             </w:rPr>
           </w:pPr>
-          <w:hyperlink w:anchor="_Toc227058598" w:history="1">
+          <w:hyperlink w:anchor="_Toc230628513" w:history="1">
             <w:r>
               <w:rPr>
                 <w:rStyle w:val="Hyperlink"/>
@@ -669,7 +669,7 @@
                 <w:noProof/>
                 <w:webHidden/>
               </w:rPr>
-              <w:instrText xml:space="preserve"> PAGEREF _Toc227058598 \h </w:instrText>
+              <w:instrText xml:space="preserve"> PAGEREF _Toc230628513 \h </w:instrText>
             </w:r>
             <w:r>
               <w:rPr>
@@ -689,7 +689,7 @@
                 <w:noProof/>
                 <w:webHidden/>
               </w:rPr>
-              <w:t>7</w:t>
+              <w:t>6</w:t>
             </w:r>
             <w:r>
               <w:rPr>
@@ -713,7 +713,7 @@
               <w:lang w:eastAsia="pt-BR"/>
             </w:rPr>
           </w:pPr>
-          <w:hyperlink w:anchor="_Toc227058599" w:history="1">
+          <w:hyperlink w:anchor="_Toc230628514" w:history="1">
             <w:r>
               <w:rPr>
                 <w:rStyle w:val="Hyperlink"/>
@@ -757,7 +757,7 @@
                 <w:noProof/>
                 <w:webHidden/>
               </w:rPr>
-              <w:instrText xml:space="preserve"> PAGEREF _Toc227058599 \h </w:instrText>
+              <w:instrText xml:space="preserve"> PAGEREF _Toc230628514 \h </w:instrText>
             </w:r>
             <w:r>
               <w:rPr>
@@ -777,7 +777,7 @@
                 <w:noProof/>
                 <w:webHidden/>
               </w:rPr>
-              <w:t>9</w:t>
+              <w:t>8</w:t>
             </w:r>
             <w:r>
               <w:rPr>
@@ -801,7 +801,7 @@
               <w:lang w:eastAsia="pt-BR"/>
             </w:rPr>
           </w:pPr>
-          <w:hyperlink w:anchor="_Toc227058600" w:history="1">
+          <w:hyperlink w:anchor="_Toc230628515" w:history="1">
             <w:r>
               <w:rPr>
                 <w:rStyle w:val="Hyperlink"/>
@@ -845,7 +845,7 @@
                 <w:noProof/>
                 <w:webHidden/>
               </w:rPr>
-              <w:instrText xml:space="preserve"> PAGEREF _Toc227058600 \h </w:instrText>
+              <w:instrText xml:space="preserve"> PAGEREF _Toc230628515 \h </w:instrText>
             </w:r>
             <w:r>
               <w:rPr>
@@ -865,7 +865,7 @@
                 <w:noProof/>
                 <w:webHidden/>
               </w:rPr>
-              <w:t>9</w:t>
+              <w:t>8</w:t>
             </w:r>
             <w:r>
               <w:rPr>
@@ -889,7 +889,7 @@
               <w:lang w:eastAsia="pt-BR"/>
             </w:rPr>
           </w:pPr>
-          <w:hyperlink w:anchor="_Toc227058601" w:history="1">
+          <w:hyperlink w:anchor="_Toc230628516" w:history="1">
             <w:r>
               <w:rPr>
                 <w:rStyle w:val="Hyperlink"/>
@@ -931,7 +931,7 @@
                 <w:noProof/>
                 <w:webHidden/>
               </w:rPr>
-              <w:instrText xml:space="preserve"> PAGEREF _Toc227058601 \h </w:instrText>
+              <w:instrText xml:space="preserve"> PAGEREF _Toc230628516 \h </w:instrText>
             </w:r>
             <w:r>
               <w:rPr>
@@ -951,7 +951,7 @@
                 <w:noProof/>
                 <w:webHidden/>
               </w:rPr>
-              <w:t>9</w:t>
+              <w:t>8</w:t>
             </w:r>
             <w:r>
               <w:rPr>
@@ -975,7 +975,7 @@
               <w:lang w:eastAsia="pt-BR"/>
             </w:rPr>
           </w:pPr>
-          <w:hyperlink w:anchor="_Toc227058602" w:history="1">
+          <w:hyperlink w:anchor="_Toc230628517" w:history="1">
             <w:r>
               <w:rPr>
                 <w:rStyle w:val="Hyperlink"/>
@@ -1017,7 +1017,7 @@
                 <w:noProof/>
                 <w:webHidden/>
               </w:rPr>
-              <w:instrText xml:space="preserve"> PAGEREF _Toc227058602 \h </w:instrText>
+              <w:instrText xml:space="preserve"> PAGEREF _Toc230628517 \h </w:instrText>
             </w:r>
             <w:r>
               <w:rPr>
@@ -1037,7 +1037,7 @@
                 <w:noProof/>
                 <w:webHidden/>
               </w:rPr>
-              <w:t>9</w:t>
+              <w:t>8</w:t>
             </w:r>
             <w:r>
               <w:rPr>
@@ -1061,7 +1061,7 @@
               <w:lang w:eastAsia="pt-BR"/>
             </w:rPr>
           </w:pPr>
-          <w:hyperlink w:anchor="_Toc227058603" w:history="1">
+          <w:hyperlink w:anchor="_Toc230628518" w:history="1">
             <w:r>
               <w:rPr>
                 <w:rStyle w:val="Hyperlink"/>
@@ -1105,7 +1105,7 @@
                 <w:noProof/>
                 <w:webHidden/>
               </w:rPr>
-              <w:instrText xml:space="preserve"> PAGEREF _Toc227058603 \h </w:instrText>
+              <w:instrText xml:space="preserve"> PAGEREF _Toc230628518 \h </w:instrText>
             </w:r>
             <w:r>
               <w:rPr>
@@ -1125,7 +1125,7 @@
                 <w:noProof/>
                 <w:webHidden/>
               </w:rPr>
-              <w:t>10</w:t>
+              <w:t>9</w:t>
             </w:r>
             <w:r>
               <w:rPr>
@@ -1149,7 +1149,7 @@
               <w:lang w:eastAsia="pt-BR"/>
             </w:rPr>
           </w:pPr>
-          <w:hyperlink w:anchor="_Toc227058604" w:history="1">
+          <w:hyperlink w:anchor="_Toc230628519" w:history="1">
             <w:r>
               <w:rPr>
                 <w:rStyle w:val="Hyperlink"/>
@@ -1191,7 +1191,7 @@
                 <w:noProof/>
                 <w:webHidden/>
               </w:rPr>
-              <w:instrText xml:space="preserve"> PAGEREF _Toc227058604 \h </w:instrText>
+              <w:instrText xml:space="preserve"> PAGEREF _Toc230628519 \h </w:instrText>
             </w:r>
             <w:r>
               <w:rPr>
@@ -1211,7 +1211,7 @@
                 <w:noProof/>
                 <w:webHidden/>
               </w:rPr>
-              <w:t>11</w:t>
+              <w:t>10</w:t>
             </w:r>
             <w:r>
               <w:rPr>
@@ -1235,7 +1235,7 @@
               <w:lang w:eastAsia="pt-BR"/>
             </w:rPr>
           </w:pPr>
-          <w:hyperlink w:anchor="_Toc227058605" w:history="1">
+          <w:hyperlink w:anchor="_Toc230628520" w:history="1">
             <w:r>
               <w:rPr>
                 <w:rStyle w:val="Hyperlink"/>
@@ -1277,7 +1277,7 @@
                 <w:noProof/>
                 <w:webHidden/>
               </w:rPr>
-              <w:instrText xml:space="preserve"> PAGEREF _Toc227058605 \h </w:instrText>
+              <w:instrText xml:space="preserve"> PAGEREF _Toc230628520 \h </w:instrText>
             </w:r>
             <w:r>
               <w:rPr>
@@ -1297,7 +1297,7 @@
                 <w:noProof/>
                 <w:webHidden/>
               </w:rPr>
-              <w:t>11</w:t>
+              <w:t>10</w:t>
             </w:r>
             <w:r>
               <w:rPr>
@@ -1321,7 +1321,7 @@
               <w:lang w:eastAsia="pt-BR"/>
             </w:rPr>
           </w:pPr>
-          <w:hyperlink w:anchor="_Toc227058606" w:history="1">
+          <w:hyperlink w:anchor="_Toc230628521" w:history="1">
             <w:r>
               <w:rPr>
                 <w:rStyle w:val="Hyperlink"/>
@@ -1363,7 +1363,7 @@
                 <w:noProof/>
                 <w:webHidden/>
               </w:rPr>
-              <w:instrText xml:space="preserve"> PAGEREF _Toc227058606 \h </w:instrText>
+              <w:instrText xml:space="preserve"> PAGEREF _Toc230628521 \h </w:instrText>
             </w:r>
             <w:r>
               <w:rPr>
@@ -1383,7 +1383,7 @@
                 <w:noProof/>
                 <w:webHidden/>
               </w:rPr>
-              <w:t>12</w:t>
+              <w:t>11</w:t>
             </w:r>
             <w:r>
               <w:rPr>
@@ -1407,7 +1407,7 @@
               <w:lang w:eastAsia="pt-BR"/>
             </w:rPr>
           </w:pPr>
-          <w:hyperlink w:anchor="_Toc227058607" w:history="1">
+          <w:hyperlink w:anchor="_Toc230628522" w:history="1">
             <w:r>
               <w:rPr>
                 <w:rStyle w:val="Hyperlink"/>
@@ -1449,7 +1449,7 @@
                 <w:noProof/>
                 <w:webHidden/>
               </w:rPr>
-              <w:instrText xml:space="preserve"> PAGEREF _Toc227058607 \h </w:instrText>
+              <w:instrText xml:space="preserve"> PAGEREF _Toc230628522 \h </w:instrText>
             </w:r>
             <w:r>
               <w:rPr>
@@ -1469,7 +1469,7 @@
                 <w:noProof/>
                 <w:webHidden/>
               </w:rPr>
-              <w:t>12</w:t>
+              <w:t>11</w:t>
             </w:r>
             <w:r>
               <w:rPr>
@@ -1493,7 +1493,7 @@
               <w:lang w:eastAsia="pt-BR"/>
             </w:rPr>
           </w:pPr>
-          <w:hyperlink w:anchor="_Toc227058608" w:history="1">
+          <w:hyperlink w:anchor="_Toc230628523" w:history="1">
             <w:r>
               <w:rPr>
                 <w:rStyle w:val="Hyperlink"/>
@@ -1535,7 +1535,7 @@
                 <w:noProof/>
                 <w:webHidden/>
               </w:rPr>
-              <w:instrText xml:space="preserve"> PAGEREF _Toc227058608 \h </w:instrText>
+              <w:instrText xml:space="preserve"> PAGEREF _Toc230628523 \h </w:instrText>
             </w:r>
             <w:r>
               <w:rPr>
@@ -1555,7 +1555,7 @@
                 <w:noProof/>
                 <w:webHidden/>
               </w:rPr>
-              <w:t>12</w:t>
+              <w:t>11</w:t>
             </w:r>
             <w:r>
               <w:rPr>
@@ -1579,7 +1579,7 @@
               <w:lang w:eastAsia="pt-BR"/>
             </w:rPr>
           </w:pPr>
-          <w:hyperlink w:anchor="_Toc227058609" w:history="1">
+          <w:hyperlink w:anchor="_Toc230628524" w:history="1">
             <w:r>
               <w:rPr>
                 <w:rStyle w:val="Hyperlink"/>
@@ -1621,7 +1621,7 @@
                 <w:noProof/>
                 <w:webHidden/>
               </w:rPr>
-              <w:instrText xml:space="preserve"> PAGEREF _Toc227058609 \h </w:instrText>
+              <w:instrText xml:space="preserve"> PAGEREF _Toc230628524 \h </w:instrText>
             </w:r>
             <w:r>
               <w:rPr>
@@ -1641,7 +1641,7 @@
                 <w:noProof/>
                 <w:webHidden/>
               </w:rPr>
-              <w:t>13</w:t>
+              <w:t>12</w:t>
             </w:r>
             <w:r>
               <w:rPr>
@@ -1665,7 +1665,7 @@
               <w:lang w:eastAsia="pt-BR"/>
             </w:rPr>
           </w:pPr>
-          <w:hyperlink w:anchor="_Toc227058610" w:history="1">
+          <w:hyperlink w:anchor="_Toc230628525" w:history="1">
             <w:r>
               <w:rPr>
                 <w:rStyle w:val="Hyperlink"/>
@@ -1707,7 +1707,7 @@
                 <w:noProof/>
                 <w:webHidden/>
               </w:rPr>
-              <w:instrText xml:space="preserve"> PAGEREF _Toc227058610 \h </w:instrText>
+              <w:instrText xml:space="preserve"> PAGEREF _Toc230628525 \h </w:instrText>
             </w:r>
             <w:r>
               <w:rPr>
@@ -1727,7 +1727,7 @@
                 <w:noProof/>
                 <w:webHidden/>
               </w:rPr>
-              <w:t>13</w:t>
+              <w:t>12</w:t>
             </w:r>
             <w:r>
               <w:rPr>
@@ -1751,7 +1751,7 @@
               <w:lang w:eastAsia="pt-BR"/>
             </w:rPr>
           </w:pPr>
-          <w:hyperlink w:anchor="_Toc227058611" w:history="1">
+          <w:hyperlink w:anchor="_Toc230628526" w:history="1">
             <w:r>
               <w:rPr>
                 <w:rStyle w:val="Hyperlink"/>
@@ -1793,7 +1793,7 @@
                 <w:noProof/>
                 <w:webHidden/>
               </w:rPr>
-              <w:instrText xml:space="preserve"> PAGEREF _Toc227058611 \h </w:instrText>
+              <w:instrText xml:space="preserve"> PAGEREF _Toc230628526 \h </w:instrText>
             </w:r>
             <w:r>
               <w:rPr>
@@ -1813,7 +1813,7 @@
                 <w:noProof/>
                 <w:webHidden/>
               </w:rPr>
-              <w:t>14</w:t>
+              <w:t>13</w:t>
             </w:r>
             <w:r>
               <w:rPr>
@@ -1837,7 +1837,7 @@
               <w:lang w:eastAsia="pt-BR"/>
             </w:rPr>
           </w:pPr>
-          <w:hyperlink w:anchor="_Toc227058612" w:history="1">
+          <w:hyperlink w:anchor="_Toc230628527" w:history="1">
             <w:r>
               <w:rPr>
                 <w:rStyle w:val="Hyperlink"/>
@@ -1879,7 +1879,7 @@
                 <w:noProof/>
                 <w:webHidden/>
               </w:rPr>
-              <w:instrText xml:space="preserve"> PAGEREF _Toc227058612 \h </w:instrText>
+              <w:instrText xml:space="preserve"> PAGEREF _Toc230628527 \h </w:instrText>
             </w:r>
             <w:r>
               <w:rPr>
@@ -1899,7 +1899,7 @@
                 <w:noProof/>
                 <w:webHidden/>
               </w:rPr>
-              <w:t>14</w:t>
+              <w:t>13</w:t>
             </w:r>
             <w:r>
               <w:rPr>
@@ -1923,7 +1923,7 @@
               <w:lang w:eastAsia="pt-BR"/>
             </w:rPr>
           </w:pPr>
-          <w:hyperlink w:anchor="_Toc227058613" w:history="1">
+          <w:hyperlink w:anchor="_Toc230628528" w:history="1">
             <w:r>
               <w:rPr>
                 <w:rStyle w:val="Hyperlink"/>
@@ -1965,7 +1965,7 @@
                 <w:noProof/>
                 <w:webHidden/>
               </w:rPr>
-              <w:instrText xml:space="preserve"> PAGEREF _Toc227058613 \h </w:instrText>
+              <w:instrText xml:space="preserve"> PAGEREF _Toc230628528 \h </w:instrText>
             </w:r>
             <w:r>
               <w:rPr>
@@ -1985,7 +1985,7 @@
                 <w:noProof/>
                 <w:webHidden/>
               </w:rPr>
-              <w:t>15</w:t>
+              <w:t>14</w:t>
             </w:r>
             <w:r>
               <w:rPr>
@@ -2009,7 +2009,7 @@
               <w:lang w:eastAsia="pt-BR"/>
             </w:rPr>
           </w:pPr>
-          <w:hyperlink w:anchor="_Toc227058614" w:history="1">
+          <w:hyperlink w:anchor="_Toc230628529" w:history="1">
             <w:r>
               <w:rPr>
                 <w:rStyle w:val="Hyperlink"/>
@@ -2052,7 +2052,7 @@
                 <w:noProof/>
                 <w:webHidden/>
               </w:rPr>
-              <w:instrText xml:space="preserve"> PAGEREF _Toc227058614 \h </w:instrText>
+              <w:instrText xml:space="preserve"> PAGEREF _Toc230628529 \h </w:instrText>
             </w:r>
             <w:r>
               <w:rPr>
@@ -2072,7 +2072,7 @@
                 <w:noProof/>
                 <w:webHidden/>
               </w:rPr>
-              <w:t>16</w:t>
+              <w:t>15</w:t>
             </w:r>
             <w:r>
               <w:rPr>
@@ -2096,7 +2096,7 @@
               <w:lang w:eastAsia="pt-BR"/>
             </w:rPr>
           </w:pPr>
-          <w:hyperlink w:anchor="_Toc227058615" w:history="1">
+          <w:hyperlink w:anchor="_Toc230628530" w:history="1">
             <w:r>
               <w:rPr>
                 <w:rStyle w:val="Hyperlink"/>
@@ -2138,7 +2138,7 @@
                 <w:noProof/>
                 <w:webHidden/>
               </w:rPr>
-              <w:instrText xml:space="preserve"> PAGEREF _Toc227058615 \h </w:instrText>
+              <w:instrText xml:space="preserve"> PAGEREF _Toc230628530 \h </w:instrText>
             </w:r>
             <w:r>
               <w:rPr>
@@ -2158,7 +2158,7 @@
                 <w:noProof/>
                 <w:webHidden/>
               </w:rPr>
-              <w:t>16</w:t>
+              <w:t>15</w:t>
             </w:r>
             <w:r>
               <w:rPr>
@@ -2182,7 +2182,7 @@
               <w:lang w:eastAsia="pt-BR"/>
             </w:rPr>
           </w:pPr>
-          <w:hyperlink w:anchor="_Toc227058616" w:history="1">
+          <w:hyperlink w:anchor="_Toc230628531" w:history="1">
             <w:r>
               <w:rPr>
                 <w:rStyle w:val="Hyperlink"/>
@@ -2224,7 +2224,95 @@
                 <w:noProof/>
                 <w:webHidden/>
               </w:rPr>
-              <w:instrText xml:space="preserve"> PAGEREF _Toc227058616 \h </w:instrText>
+              <w:instrText xml:space="preserve"> PAGEREF _Toc230628531 \h </w:instrText>
+            </w:r>
+            <w:r>
+              <w:rPr>
+                <w:noProof/>
+                <w:webHidden/>
+              </w:rPr>
+            </w:r>
+            <w:r>
+              <w:rPr>
+                <w:noProof/>
+                <w:webHidden/>
+              </w:rPr>
+              <w:fldChar w:fldCharType="separate"/>
+            </w:r>
+            <w:r>
+              <w:rPr>
+                <w:noProof/>
+                <w:webHidden/>
+              </w:rPr>
+              <w:t>15</w:t>
+            </w:r>
+            <w:r>
+              <w:rPr>
+                <w:noProof/>
+                <w:webHidden/>
+              </w:rPr>
+              <w:fldChar w:fldCharType="end"/>
+            </w:r>
+          </w:hyperlink>
+        </w:p>
+        <w:p>
+          <w:pPr>
+            <w:pStyle w:val="Sumrio1"/>
+            <w:tabs>
+              <w:tab w:val="left" w:pos="480"/>
+              <w:tab w:val="right" w:leader="dot" w:pos="9061"/>
+            </w:tabs>
+            <w:rPr>
+              <w:rFonts w:asciiTheme="minorHAnsi" w:eastAsiaTheme="minorEastAsia" w:hAnsiTheme="minorHAnsi" w:cstheme="minorBidi"/>
+              <w:noProof/>
+              <w:lang w:eastAsia="pt-BR"/>
+            </w:rPr>
+          </w:pPr>
+          <w:hyperlink w:anchor="_Toc230628532" w:history="1">
+            <w:r>
+              <w:rPr>
+                <w:rStyle w:val="Hyperlink"/>
+                <w:noProof/>
+                <w:highlight w:val="white"/>
+              </w:rPr>
+              <w:t>6</w:t>
+            </w:r>
+            <w:r>
+              <w:rPr>
+                <w:rFonts w:asciiTheme="minorHAnsi" w:eastAsiaTheme="minorEastAsia" w:hAnsiTheme="minorHAnsi" w:cstheme="minorBidi"/>
+                <w:noProof/>
+                <w:lang w:eastAsia="pt-BR"/>
+              </w:rPr>
+              <w:tab/>
+            </w:r>
+            <w:r>
+              <w:rPr>
+                <w:rStyle w:val="Hyperlink"/>
+                <w:noProof/>
+                <w:highlight w:val="white"/>
+              </w:rPr>
+              <w:t>DIAGRAMA DE CLASSES (UML)</w:t>
+            </w:r>
+            <w:r>
+              <w:rPr>
+                <w:noProof/>
+                <w:webHidden/>
+              </w:rPr>
+              <w:tab/>
+            </w:r>
+            <w:r>
+              <w:rPr>
+                <w:noProof/>
+                <w:webHidden/>
+              </w:rPr>
+              <w:fldChar w:fldCharType="begin"/>
+            </w:r>
+            <w:r>
+              <w:rPr>
+                <w:noProof/>
+                <w:webHidden/>
+              </w:rPr>
+              <w:instrText xml:space="preserve"> PAGEREF _Toc230628532 \h </w:instrText>
             </w:r>
             <w:r>
               <w:rPr>
@@ -2267,14 +2355,13 @@
               <w:lang w:eastAsia="pt-BR"/>
             </w:rPr>
           </w:pPr>
-          <w:hyperlink w:anchor="_Toc227058617" w:history="1">
+          <w:hyperlink w:anchor="_Toc230628533" w:history="1">
             <w:r>
               <w:rPr>
                 <w:rStyle w:val="Hyperlink"/>
                 <w:noProof/>
-                <w:highlight w:val="white"/>
-              </w:rPr>
-              <w:t>REFERÊNCIAS BIBLIOGRÁFICAS</w:t>
+              </w:rPr>
+              <w:t>7 FLUXO DE SEQUÊNCIA</w:t>
             </w:r>
             <w:r>
               <w:rPr>
@@ -2295,7 +2382,7 @@
                 <w:noProof/>
                 <w:webHidden/>
               </w:rPr>
-              <w:instrText xml:space="preserve"> PAGEREF _Toc227058617 \h </w:instrText>
+              <w:instrText xml:space="preserve"> PAGEREF _Toc230628533 \h </w:instrText>
             </w:r>
             <w:r>
               <w:rPr>
@@ -2327,6 +2414,85 @@
           </w:hyperlink>
         </w:p>
         <w:p>
+          <w:pPr>
+            <w:pStyle w:val="Sumrio1"/>
+            <w:tabs>
+              <w:tab w:val="right" w:leader="dot" w:pos="9061"/>
+            </w:tabs>
+            <w:rPr>
+              <w:rFonts w:asciiTheme="minorHAnsi" w:eastAsiaTheme="minorEastAsia" w:hAnsiTheme="minorHAnsi" w:cstheme="minorBidi"/>
+              <w:noProof/>
+              <w:lang w:eastAsia="pt-BR"/>
+            </w:rPr>
+          </w:pPr>
+          <w:hyperlink w:anchor="_Toc230628534" w:history="1">
+            <w:r>
+              <w:rPr>
+                <w:rStyle w:val="Hyperlink"/>
+                <w:noProof/>
+                <w:highlight w:val="white"/>
+              </w:rPr>
+              <w:t>REFERÊNCIAS BIBLIOGRÁFICAS</w:t>
+            </w:r>
+            <w:r>
+              <w:rPr>
+                <w:noProof/>
+                <w:webHidden/>
+              </w:rPr>
+              <w:tab/>
+            </w:r>
+            <w:r>
+              <w:rPr>
+                <w:noProof/>
+                <w:webHidden/>
+              </w:rPr>
+              <w:fldChar w:fldCharType="begin"/>
+            </w:r>
+            <w:r>
+              <w:rPr>
+                <w:noProof/>
+                <w:webHidden/>
+              </w:rPr>
+              <w:instrText xml:space="preserve"> PAGEREF _Toc230628534 \h </w:instrText>
+            </w:r>
+            <w:r>
+              <w:rPr>
+                <w:noProof/>
+                <w:webHidden/>
+              </w:rPr>
+            </w:r>
+            <w:r>
+              <w:rPr>
+                <w:noProof/>
+                <w:webHidden/>
+              </w:rPr>
+              <w:fldChar w:fldCharType="separate"/>
+            </w:r>
+            <w:r>
+              <w:rPr>
+                <w:noProof/>
+                <w:webHidden/>
+              </w:rPr>
+              <w:t>18</w:t>
+            </w:r>
+            <w:r>
+              <w:rPr>
+                <w:noProof/>
+                <w:webHidden/>
+              </w:rPr>
+              <w:fldChar w:fldCharType="end"/>
+            </w:r>
+          </w:hyperlink>
+        </w:p>
+        <w:p>
+          <w:pPr>
+            <w:sectPr>
+              <w:pgSz w:w="11906" w:h="16838"/>
+              <w:pgMar w:top="1701" w:right="1134" w:bottom="1134" w:left="1701" w:header="709" w:footer="709" w:gutter="0"/>
+              <w:cols w:space="708"/>
+              <w:docGrid w:linePitch="360"/>
+            </w:sectPr>
+          </w:pPr>
           <w:r>
             <w:rPr>
               <w:b/>
@@ -2337,37 +2503,11 @@
         </w:p>
       </w:sdtContent>
     </w:sdt>
-    <w:p/>
-    <w:p>
-      <w:pPr>
-        <w:rPr>
-          <w:b/>
-          <w:bCs/>
-          <w:sz w:val="28"/>
-          <w:szCs w:val="28"/>
-        </w:rPr>
-        <w:sectPr>
-          <w:pgSz w:w="11906" w:h="16838"/>
-          <w:pgMar w:top="1701" w:right="1134" w:bottom="1134" w:left="1701" w:header="709" w:footer="709" w:gutter="0"/>
-          <w:cols w:space="708"/>
-          <w:docGrid w:linePitch="360"/>
-        </w:sectPr>
-      </w:pPr>
-      <w:r>
-        <w:rPr>
-          <w:b/>
-          <w:bCs/>
-          <w:sz w:val="28"/>
-          <w:szCs w:val="28"/>
-        </w:rPr>
-        <w:br w:type="page"/>
-      </w:r>
-    </w:p>
     <w:p>
       <w:pPr>
         <w:pStyle w:val="Ttulo"/>
       </w:pPr>
-      <w:bookmarkStart w:id="0" w:name="_Toc227058594"/>
+      <w:bookmarkStart w:id="0" w:name="_Toc230628509"/>
       <w:r>
         <w:lastRenderedPageBreak/>
         <w:t>1.</w:t>
@@ -2486,7 +2626,7 @@
           <w:noProof/>
         </w:rPr>
         <w:drawing>
-          <wp:inline distT="0" distB="0" distL="0" distR="0" wp14:anchorId="79D53042" wp14:editId="4246F467">
+          <wp:inline distT="0" distB="0" distL="0" distR="0" wp14:anchorId="79D53042" wp14:editId="147C024D">
             <wp:extent cx="5534660" cy="3825875"/>
             <wp:effectExtent l="0" t="0" r="8890" b="3175"/>
             <wp:docPr id="417717608" name="Imagem 5"/>
@@ -2623,7 +2763,7 @@
       <w:pPr>
         <w:pStyle w:val="Ttulo2"/>
       </w:pPr>
-      <w:bookmarkStart w:id="1" w:name="_Toc227058595"/>
+      <w:bookmarkStart w:id="1" w:name="_Toc230628510"/>
       <w:r>
         <w:t>Arquitetura Funcional do SAGITARIO</w:t>
       </w:r>
@@ -2854,7 +2994,7 @@
       <w:pPr>
         <w:pStyle w:val="Ttulo2"/>
       </w:pPr>
-      <w:bookmarkStart w:id="2" w:name="_Toc227058596"/>
+      <w:bookmarkStart w:id="2" w:name="_Toc230628511"/>
       <w:r>
         <w:t>Estrutura de controle do espaço aéreo</w:t>
       </w:r>
@@ -2982,7 +3122,7 @@
           <w:color w:val="000000" w:themeColor="text1"/>
         </w:rPr>
       </w:pPr>
-      <w:bookmarkStart w:id="3" w:name="_Toc227058597"/>
+      <w:bookmarkStart w:id="3" w:name="_Toc230628512"/>
       <w:r>
         <w:rPr>
           <w:rStyle w:val="Ttulo2Char"/>
@@ -3180,7 +3320,7 @@
       <w:pPr>
         <w:pStyle w:val="Ttulo2"/>
       </w:pPr>
-      <w:bookmarkStart w:id="4" w:name="_Toc227058598"/>
+      <w:bookmarkStart w:id="4" w:name="_Toc230628513"/>
       <w:r>
         <w:rPr>
           <w:rStyle w:val="Ttulo2Char"/>
@@ -3271,7 +3411,7 @@
           <w:highlight w:val="white"/>
         </w:rPr>
       </w:pPr>
-      <w:bookmarkStart w:id="5" w:name="_Toc227058599"/>
+      <w:bookmarkStart w:id="5" w:name="_Toc230628514"/>
       <w:r>
         <w:rPr>
           <w:rStyle w:val="TtuloChar"/>
@@ -3293,7 +3433,7 @@
           <w:highlight w:val="white"/>
         </w:rPr>
       </w:pPr>
-      <w:bookmarkStart w:id="6" w:name="_Toc227058600"/>
+      <w:bookmarkStart w:id="6" w:name="_Toc230628515"/>
       <w:r>
         <w:rPr>
           <w:highlight w:val="white"/>
@@ -3332,7 +3472,7 @@
       <w:pPr>
         <w:pStyle w:val="Ttulo2"/>
       </w:pPr>
-      <w:bookmarkStart w:id="7" w:name="_Toc227058601"/>
+      <w:bookmarkStart w:id="7" w:name="_Toc230628516"/>
       <w:r>
         <w:t>Objetivos Específicos</w:t>
       </w:r>
@@ -3412,7 +3552,7 @@
           <w:szCs w:val="24"/>
         </w:rPr>
       </w:pPr>
-      <w:bookmarkStart w:id="8" w:name="_Toc227058602"/>
+      <w:bookmarkStart w:id="8" w:name="_Toc230628517"/>
       <w:r>
         <w:t xml:space="preserve">Diagrama de Visão de </w:t>
       </w:r>
@@ -3537,7 +3677,7 @@
           <w:highlight w:val="white"/>
         </w:rPr>
       </w:pPr>
-      <w:bookmarkStart w:id="9" w:name="_Toc227058603"/>
+      <w:bookmarkStart w:id="9" w:name="_Toc230628518"/>
       <w:r>
         <w:rPr>
           <w:highlight w:val="white"/>
@@ -3607,7 +3747,7 @@
           <w:numId w:val="31"/>
         </w:numPr>
       </w:pPr>
-      <w:bookmarkStart w:id="10" w:name="_Toc227058604"/>
+      <w:bookmarkStart w:id="10" w:name="_Toc230628519"/>
       <w:r>
         <w:lastRenderedPageBreak/>
         <w:t>ESCOPO</w:t>
@@ -3618,7 +3758,7 @@
       <w:pPr>
         <w:pStyle w:val="Ttulo2"/>
       </w:pPr>
-      <w:bookmarkStart w:id="11" w:name="_Toc227058605"/>
+      <w:bookmarkStart w:id="11" w:name="_Toc230628520"/>
       <w:r>
         <w:t>Descrição resumida do projeto</w:t>
       </w:r>
@@ -3867,7 +4007,7 @@
               </wp:anchor>
             </w:drawing>
           </mc:Choice>
-          <mc:Fallback xmlns:a14="http://schemas.microsoft.com/office/drawing/2010/main" xmlns:pic="http://schemas.openxmlformats.org/drawingml/2006/picture" xmlns:a="http://schemas.openxmlformats.org/drawingml/2006/main" xmlns:arto="http://schemas.microsoft.com/office/word/2006/arto">
+          <mc:Fallback xmlns:arto="http://schemas.microsoft.com/office/word/2006/arto" xmlns:a="http://schemas.openxmlformats.org/drawingml/2006/main" xmlns:pic="http://schemas.openxmlformats.org/drawingml/2006/picture" xmlns:a14="http://schemas.microsoft.com/office/drawing/2010/main">
             <w:pict>
               <v:rect id="Retângulo 7" style="position:absolute;margin-left:311.75pt;margin-top:75.6pt;width:99.2pt;height:19.85pt;z-index:251661312;visibility:visible;mso-wrap-style:square;mso-width-percent:0;mso-height-percent:0;mso-wrap-distance-left:9pt;mso-wrap-distance-top:0;mso-wrap-distance-right:9pt;mso-wrap-distance-bottom:0;mso-position-horizontal:absolute;mso-position-horizontal-relative:text;mso-position-vertical:absolute;mso-position-vertical-relative:text;mso-width-percent:0;mso-height-percent:0;mso-width-relative:margin;mso-height-relative:margin;v-text-anchor:middle" o:spid="_x0000_s1026" fillcolor="#45b0e1 [1940]" stroked="f" strokeweight="1.5pt" w14:anchorId="07B4DEAF" o:gfxdata="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">
                 <v:fill opacity="32896f"/>
@@ -3947,7 +4087,7 @@
               </wp:anchor>
             </w:drawing>
           </mc:Choice>
-          <mc:Fallback xmlns:a14="http://schemas.microsoft.com/office/drawing/2010/main" xmlns:pic="http://schemas.openxmlformats.org/drawingml/2006/picture" xmlns:a="http://schemas.openxmlformats.org/drawingml/2006/main" xmlns:arto="http://schemas.microsoft.com/office/word/2006/arto">
+          <mc:Fallback xmlns:arto="http://schemas.microsoft.com/office/word/2006/arto" xmlns:a="http://schemas.openxmlformats.org/drawingml/2006/main" xmlns:pic="http://schemas.openxmlformats.org/drawingml/2006/picture" xmlns:a14="http://schemas.microsoft.com/office/drawing/2010/main">
             <w:pict>
               <v:rect id="Retângulo 7" style="position:absolute;margin-left:141.25pt;margin-top:63pt;width:108.45pt;height:16.85pt;z-index:251659264;visibility:visible;mso-wrap-style:square;mso-wrap-distance-left:9pt;mso-wrap-distance-top:0;mso-wrap-distance-right:9pt;mso-wrap-distance-bottom:0;mso-position-horizontal:absolute;mso-position-horizontal-relative:text;mso-position-vertical:absolute;mso-position-vertical-relative:text;v-text-anchor:middle" o:spid="_x0000_s1026" fillcolor="#45b0e1 [1940]" stroked="f" strokeweight="1.5pt" w14:anchorId="070A92C7" o:gfxdata="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">
                 <v:fill opacity="32896f"/>
@@ -4057,7 +4197,7 @@
       </w:pPr>
       <w:bookmarkStart w:id="12" w:name="_Toc226449985"/>
       <w:bookmarkStart w:id="13" w:name="_Toc226450029"/>
-      <w:bookmarkStart w:id="14" w:name="_Toc227058606"/>
+      <w:bookmarkStart w:id="14" w:name="_Toc230628521"/>
       <w:r>
         <w:t xml:space="preserve">Diagrama de </w:t>
       </w:r>
@@ -4171,7 +4311,7 @@
       </w:pPr>
       <w:bookmarkStart w:id="15" w:name="_Toc226449986"/>
       <w:bookmarkStart w:id="16" w:name="_Toc226450030"/>
-      <w:bookmarkStart w:id="17" w:name="_Toc227058607"/>
+      <w:bookmarkStart w:id="17" w:name="_Toc230628522"/>
       <w:r>
         <w:t>Resultados Esperados</w:t>
       </w:r>
@@ -4201,7 +4341,7 @@
       </w:pPr>
       <w:bookmarkStart w:id="18" w:name="_Toc226449987"/>
       <w:bookmarkStart w:id="19" w:name="_Toc226450031"/>
-      <w:bookmarkStart w:id="20" w:name="_Toc227058608"/>
+      <w:bookmarkStart w:id="20" w:name="_Toc230628523"/>
       <w:r>
         <w:t>Requisitos do Projeto</w:t>
       </w:r>
@@ -4250,7 +4390,7 @@
       </w:pPr>
       <w:bookmarkStart w:id="21" w:name="_Toc226449988"/>
       <w:bookmarkStart w:id="22" w:name="_Toc226450032"/>
-      <w:bookmarkStart w:id="23" w:name="_Toc227058609"/>
+      <w:bookmarkStart w:id="23" w:name="_Toc230628524"/>
       <w:r>
         <w:lastRenderedPageBreak/>
         <w:t>Limites e Exclusões</w:t>
@@ -4481,7 +4621,7 @@
       </w:pPr>
       <w:bookmarkStart w:id="24" w:name="_Toc226449989"/>
       <w:bookmarkStart w:id="25" w:name="_Toc226450033"/>
-      <w:bookmarkStart w:id="26" w:name="_Toc227058610"/>
+      <w:bookmarkStart w:id="26" w:name="_Toc230628525"/>
       <w:r>
         <w:t>Macro Cronograma</w:t>
       </w:r>
@@ -5276,7 +5416,7 @@
       </w:pPr>
       <w:bookmarkStart w:id="27" w:name="_Toc226449990"/>
       <w:bookmarkStart w:id="28" w:name="_Toc226450034"/>
-      <w:bookmarkStart w:id="29" w:name="_Toc227058611"/>
+      <w:bookmarkStart w:id="29" w:name="_Toc230628526"/>
       <w:r>
         <w:lastRenderedPageBreak/>
         <w:t>Recursos Necessários</w:t>
@@ -6976,7 +7116,15 @@
       </w:r>
       <w:proofErr w:type="spellEnd"/>
       <w:r>
-        <w:t xml:space="preserve"> Planner, OneDrive e o GitHub.</w:t>
+        <w:t xml:space="preserve"> </w:t>
+      </w:r>
+      <w:proofErr w:type="spellStart"/>
+      <w:r>
+        <w:t>Planner</w:t>
+      </w:r>
+      <w:proofErr w:type="spellEnd"/>
+      <w:r>
+        <w:t>, OneDrive e o GitHub.</w:t>
       </w:r>
     </w:p>
     <w:p>
@@ -6984,7 +7132,7 @@
         <w:pStyle w:val="Ttulo2"/>
       </w:pPr>
       <w:bookmarkStart w:id="30" w:name="_Toc226450035"/>
-      <w:bookmarkStart w:id="31" w:name="_Toc227058612"/>
+      <w:bookmarkStart w:id="31" w:name="_Toc230628527"/>
       <w:r>
         <w:t>Riscos</w:t>
       </w:r>
@@ -7101,7 +7249,7 @@
         <w:pStyle w:val="Ttulo2"/>
       </w:pPr>
       <w:bookmarkStart w:id="32" w:name="_Toc226450036"/>
-      <w:bookmarkStart w:id="33" w:name="_Toc227058613"/>
+      <w:bookmarkStart w:id="33" w:name="_Toc230628528"/>
       <w:r>
         <w:lastRenderedPageBreak/>
         <w:t>Stakeholders</w:t>
@@ -7927,7 +8075,7 @@
       </w:r>
       <w:bookmarkStart w:id="34" w:name="_Toc226449991"/>
       <w:bookmarkStart w:id="35" w:name="_Toc226450037"/>
-      <w:bookmarkStart w:id="36" w:name="_Toc227058614"/>
+      <w:bookmarkStart w:id="36" w:name="_Toc230628529"/>
       <w:r>
         <w:lastRenderedPageBreak/>
         <w:t>PREMISSAS E RESTRIÇÕES</w:t>
@@ -7942,7 +8090,7 @@
       </w:pPr>
       <w:bookmarkStart w:id="37" w:name="_Toc226449992"/>
       <w:bookmarkStart w:id="38" w:name="_Toc226450038"/>
-      <w:bookmarkStart w:id="39" w:name="_Toc227058615"/>
+      <w:bookmarkStart w:id="39" w:name="_Toc230628530"/>
       <w:r>
         <w:t>Premissas</w:t>
       </w:r>
@@ -8100,7 +8248,7 @@
       </w:pPr>
       <w:bookmarkStart w:id="40" w:name="_Toc226449993"/>
       <w:bookmarkStart w:id="41" w:name="_Toc226450039"/>
-      <w:bookmarkStart w:id="42" w:name="_Toc227058616"/>
+      <w:bookmarkStart w:id="42" w:name="_Toc230628531"/>
       <w:r>
         <w:t>Restrições</w:t>
       </w:r>
@@ -8190,19 +8338,106 @@
         <w:jc w:val="both"/>
       </w:pPr>
       <w:r>
-        <w:t>Os avisos para o cliente deverão ser somente feitos via Slack/Jira.</w:t>
-      </w:r>
-    </w:p>
-    <w:p>
-      <w:pPr>
+        <w:t>Os avisos para o cliente deverão ser somente feitos via Slack/</w:t>
+      </w:r>
+      <w:proofErr w:type="spellStart"/>
+      <w:r>
+        <w:t>Jira</w:t>
+      </w:r>
+      <w:proofErr w:type="spellEnd"/>
+      <w:r>
+        <w:t>.</w:t>
+      </w:r>
+    </w:p>
+    <w:p>
+      <w:r>
+        <w:br w:type="page"/>
+      </w:r>
+    </w:p>
+    <w:p>
+      <w:pPr>
+        <w:pStyle w:val="Ttulo"/>
+        <w:numPr>
+          <w:ilvl w:val="0"/>
+          <w:numId w:val="31"/>
+        </w:numPr>
         <w:rPr>
           <w:highlight w:val="white"/>
         </w:rPr>
       </w:pPr>
+      <w:bookmarkStart w:id="43" w:name="_Toc230628532"/>
       <w:r>
         <w:rPr>
           <w:highlight w:val="white"/>
         </w:rPr>
+        <w:lastRenderedPageBreak/>
+        <w:t>DIAGRAMA DE CLASSES (UML)</w:t>
+      </w:r>
+      <w:bookmarkEnd w:id="43"/>
+    </w:p>
+    <w:p>
+      <w:pPr>
+        <w:rPr>
+          <w:highlight w:val="white"/>
+        </w:rPr>
+      </w:pPr>
+      <w:r>
+        <w:rPr>
+          <w:noProof/>
+        </w:rPr>
+        <w:drawing>
+          <wp:inline distT="0" distB="0" distL="0" distR="0" wp14:anchorId="0C79D812" wp14:editId="1FA83EC0">
+            <wp:extent cx="5760085" cy="5262880"/>
+            <wp:effectExtent l="0" t="0" r="0" b="0"/>
+            <wp:docPr id="74530844" name="Imagem 4"/>
+            <wp:cNvGraphicFramePr>
+              <a:graphicFrameLocks xmlns:a="http://schemas.openxmlformats.org/drawingml/2006/main" noChangeAspect="1"/>
+            </wp:cNvGraphicFramePr>
+            <a:graphic xmlns:a="http://schemas.openxmlformats.org/drawingml/2006/main">
+              <a:graphicData uri="http://schemas.openxmlformats.org/drawingml/2006/picture">
+                <pic:pic xmlns:pic="http://schemas.openxmlformats.org/drawingml/2006/picture">
+                  <pic:nvPicPr>
+                    <pic:cNvPr id="74530844" name="Imagem 74530844"/>
+                    <pic:cNvPicPr/>
+                  </pic:nvPicPr>
+                  <pic:blipFill>
+                    <a:blip r:embed="rId13" cstate="print">
+                      <a:extLst>
+                        <a:ext uri="{28A0092B-C50C-407E-A947-70E740481C1C}">
+                          <a14:useLocalDpi xmlns:a14="http://schemas.microsoft.com/office/drawing/2010/main" val="0"/>
+                        </a:ext>
+                      </a:extLst>
+                    </a:blip>
+                    <a:stretch>
+                      <a:fillRect/>
+                    </a:stretch>
+                  </pic:blipFill>
+                  <pic:spPr>
+                    <a:xfrm>
+                      <a:off x="0" y="0"/>
+                      <a:ext cx="5760085" cy="5262880"/>
+                    </a:xfrm>
+                    <a:prstGeom prst="rect">
+                      <a:avLst/>
+                    </a:prstGeom>
+                  </pic:spPr>
+                </pic:pic>
+              </a:graphicData>
+            </a:graphic>
+          </wp:inline>
+        </w:drawing>
+      </w:r>
+    </w:p>
+    <w:p>
+      <w:pPr>
+        <w:rPr>
+          <w:highlight w:val="white"/>
+        </w:rPr>
+      </w:pPr>
+      <w:r>
+        <w:rPr>
+          <w:highlight w:val="white"/>
+        </w:rPr>
         <w:br w:type="page"/>
       </w:r>
     </w:p>
@@ -8213,9 +8448,35 @@
           <w:highlight w:val="white"/>
         </w:rPr>
       </w:pPr>
-      <w:bookmarkStart w:id="43" w:name="_Toc226449995"/>
-      <w:bookmarkStart w:id="44" w:name="_Toc226450041"/>
-      <w:bookmarkStart w:id="45" w:name="_Toc227058617"/>
+      <w:bookmarkStart w:id="44" w:name="_Toc230628533"/>
+      <w:r>
+        <w:lastRenderedPageBreak/>
+        <w:t xml:space="preserve">7 </w:t>
+      </w:r>
+      <w:r>
+        <w:t>DIAGRAMA</w:t>
+      </w:r>
+      <w:r>
+        <w:t xml:space="preserve"> DE SEQUÊNCIA</w:t>
+      </w:r>
+      <w:bookmarkEnd w:id="44"/>
+      <w:r>
+        <w:rPr>
+          <w:highlight w:val="white"/>
+        </w:rPr>
+        <w:br w:type="page"/>
+      </w:r>
+    </w:p>
+    <w:p>
+      <w:pPr>
+        <w:pStyle w:val="Ttulo"/>
+        <w:rPr>
+          <w:highlight w:val="white"/>
+        </w:rPr>
+      </w:pPr>
+      <w:bookmarkStart w:id="45" w:name="_Toc226449995"/>
+      <w:bookmarkStart w:id="46" w:name="_Toc226450041"/>
+      <w:bookmarkStart w:id="47" w:name="_Toc230628534"/>
       <w:r>
         <w:rPr>
           <w:highlight w:val="white"/>
@@ -8229,9 +8490,9 @@
         </w:rPr>
         <w:t>NCIAS BIBLIOGRÁFICAS</w:t>
       </w:r>
-      <w:bookmarkEnd w:id="43"/>
-      <w:bookmarkEnd w:id="44"/>
       <w:bookmarkEnd w:id="45"/>
+      <w:bookmarkEnd w:id="46"/>
+      <w:bookmarkEnd w:id="47"/>
     </w:p>
     <w:p>
       <w:pPr>
@@ -8253,12 +8514,12 @@
       <w:r>
         <w:t>. Disponível em:</w:t>
       </w:r>
-      <w:hyperlink r:id="rId13">
+      <w:hyperlink r:id="rId14">
         <w:r>
           <w:t xml:space="preserve"> </w:t>
         </w:r>
       </w:hyperlink>
-      <w:hyperlink r:id="rId14">
+      <w:hyperlink r:id="rId15">
         <w:r>
           <w:rPr>
             <w:rStyle w:val="Hyperlink"/>
@@ -8314,118 +8575,118 @@
       <w:r>
         <w:t>. Disponível em:</w:t>
       </w:r>
-      <w:hyperlink r:id="rId15">
-        <w:r>
-          <w:t xml:space="preserve"> </w:t>
-        </w:r>
-      </w:hyperlink>
-      <w:r>
-        <w:rPr>
-          <w:rStyle w:val="Hyperlink"/>
-        </w:rPr>
-        <w:t>https://www.gov.br/portos-e-aeroportos/pt-br/assuntos/noticias/2025/07/transporte-aereo-impulsiona-faturamento-recorde-de-r-17-bilhoes-do-turismo-brasileiro</w:t>
-      </w:r>
-      <w:r>
-        <w:t xml:space="preserve">. </w:t>
-      </w:r>
-      <w:proofErr w:type="spellStart"/>
-      <w:r>
-        <w:rPr>
-          <w:lang w:val="en-US"/>
-        </w:rPr>
-        <w:t>Acesso</w:t>
-      </w:r>
-      <w:proofErr w:type="spellEnd"/>
-      <w:r>
-        <w:rPr>
-          <w:lang w:val="en-US"/>
-        </w:rPr>
-        <w:t xml:space="preserve"> </w:t>
-      </w:r>
-      <w:proofErr w:type="spellStart"/>
-      <w:r>
-        <w:rPr>
-          <w:lang w:val="en-US"/>
-        </w:rPr>
-        <w:t>em</w:t>
-      </w:r>
-      <w:proofErr w:type="spellEnd"/>
-      <w:r>
-        <w:rPr>
-          <w:lang w:val="en-US"/>
-        </w:rPr>
-        <w:t xml:space="preserve">: 24 </w:t>
-      </w:r>
-      <w:proofErr w:type="gramStart"/>
-      <w:r>
-        <w:rPr>
-          <w:lang w:val="en-US"/>
-        </w:rPr>
-        <w:t>mar</w:t>
-      </w:r>
-      <w:proofErr w:type="gramEnd"/>
-      <w:r>
-        <w:rPr>
-          <w:lang w:val="en-US"/>
-        </w:rPr>
-        <w:t>. 2026.</w:t>
-      </w:r>
-    </w:p>
-    <w:p>
-      <w:pPr>
-        <w:spacing w:line="240" w:lineRule="auto"/>
-        <w:rPr>
-          <w:lang w:val="en-US"/>
-        </w:rPr>
-      </w:pPr>
-    </w:p>
-    <w:p>
-      <w:pPr>
-        <w:spacing w:line="240" w:lineRule="auto"/>
-      </w:pPr>
-      <w:r>
-        <w:rPr>
-          <w:lang w:val="en-US"/>
-        </w:rPr>
-        <w:t xml:space="preserve">AIRPORT INFORMATION SYSTEMS. </w:t>
-      </w:r>
-      <w:r>
-        <w:rPr>
-          <w:b/>
-          <w:bCs/>
-          <w:lang w:val="en-US"/>
-        </w:rPr>
-        <w:t>ATC and air traffic control admin system</w:t>
-      </w:r>
-      <w:r>
-        <w:rPr>
-          <w:b/>
-          <w:bCs/>
-          <w:lang w:val="en-US"/>
-        </w:rPr>
-        <w:t xml:space="preserve"> </w:t>
-      </w:r>
-      <w:r>
-        <w:rPr>
-          <w:lang w:val="en-US"/>
-        </w:rPr>
-        <w:t>2023</w:t>
-      </w:r>
-      <w:r>
-        <w:rPr>
-          <w:lang w:val="en-US"/>
-        </w:rPr>
-        <w:t xml:space="preserve">. </w:t>
-      </w:r>
-      <w:r>
-        <w:t>Disponível em:</w:t>
-      </w:r>
       <w:hyperlink r:id="rId16">
         <w:r>
           <w:t xml:space="preserve"> </w:t>
         </w:r>
       </w:hyperlink>
+      <w:r>
+        <w:rPr>
+          <w:rStyle w:val="Hyperlink"/>
+        </w:rPr>
+        <w:t>https://www.gov.br/portos-e-aeroportos/pt-br/assuntos/noticias/2025/07/transporte-aereo-impulsiona-faturamento-recorde-de-r-17-bilhoes-do-turismo-brasileiro</w:t>
+      </w:r>
+      <w:r>
+        <w:t xml:space="preserve">. </w:t>
+      </w:r>
+      <w:proofErr w:type="spellStart"/>
+      <w:r>
+        <w:rPr>
+          <w:lang w:val="en-US"/>
+        </w:rPr>
+        <w:t>Acesso</w:t>
+      </w:r>
+      <w:proofErr w:type="spellEnd"/>
+      <w:r>
+        <w:rPr>
+          <w:lang w:val="en-US"/>
+        </w:rPr>
+        <w:t xml:space="preserve"> </w:t>
+      </w:r>
+      <w:proofErr w:type="spellStart"/>
+      <w:r>
+        <w:rPr>
+          <w:lang w:val="en-US"/>
+        </w:rPr>
+        <w:t>em</w:t>
+      </w:r>
+      <w:proofErr w:type="spellEnd"/>
+      <w:r>
+        <w:rPr>
+          <w:lang w:val="en-US"/>
+        </w:rPr>
+        <w:t xml:space="preserve">: 24 </w:t>
+      </w:r>
+      <w:proofErr w:type="gramStart"/>
+      <w:r>
+        <w:rPr>
+          <w:lang w:val="en-US"/>
+        </w:rPr>
+        <w:t>mar</w:t>
+      </w:r>
+      <w:proofErr w:type="gramEnd"/>
+      <w:r>
+        <w:rPr>
+          <w:lang w:val="en-US"/>
+        </w:rPr>
+        <w:t>. 2026.</w:t>
+      </w:r>
+    </w:p>
+    <w:p>
+      <w:pPr>
+        <w:spacing w:line="240" w:lineRule="auto"/>
+        <w:rPr>
+          <w:lang w:val="en-US"/>
+        </w:rPr>
+      </w:pPr>
+    </w:p>
+    <w:p>
+      <w:pPr>
+        <w:spacing w:line="240" w:lineRule="auto"/>
+      </w:pPr>
+      <w:r>
+        <w:rPr>
+          <w:lang w:val="en-US"/>
+        </w:rPr>
+        <w:t xml:space="preserve">AIRPORT INFORMATION SYSTEMS. </w:t>
+      </w:r>
+      <w:r>
+        <w:rPr>
+          <w:b/>
+          <w:bCs/>
+          <w:lang w:val="en-US"/>
+        </w:rPr>
+        <w:t>ATC and air traffic control admin system</w:t>
+      </w:r>
+      <w:r>
+        <w:rPr>
+          <w:b/>
+          <w:bCs/>
+          <w:lang w:val="en-US"/>
+        </w:rPr>
+        <w:t xml:space="preserve"> </w:t>
+      </w:r>
+      <w:r>
+        <w:rPr>
+          <w:lang w:val="en-US"/>
+        </w:rPr>
+        <w:t>2023</w:t>
+      </w:r>
+      <w:r>
+        <w:rPr>
+          <w:lang w:val="en-US"/>
+        </w:rPr>
+        <w:t xml:space="preserve">. </w:t>
+      </w:r>
+      <w:r>
+        <w:t>Disponível em:</w:t>
+      </w:r>
       <w:hyperlink r:id="rId17">
+        <w:r>
+          <w:t xml:space="preserve"> </w:t>
+        </w:r>
+      </w:hyperlink>
+      <w:hyperlink r:id="rId18">
         <w:r>
           <w:rPr>
             <w:rStyle w:val="Hyperlink"/>
@@ -8509,12 +8770,12 @@
       <w:r>
         <w:t>. Disponível em:</w:t>
       </w:r>
-      <w:hyperlink r:id="rId18">
+      <w:hyperlink r:id="rId19">
         <w:r>
           <w:t xml:space="preserve"> </w:t>
         </w:r>
       </w:hyperlink>
-      <w:hyperlink r:id="rId19">
+      <w:hyperlink r:id="rId20">
         <w:r>
           <w:rPr>
             <w:rStyle w:val="Hyperlink"/>
@@ -8567,12 +8828,12 @@
       <w:r>
         <w:t>. Disponível em:</w:t>
       </w:r>
-      <w:hyperlink r:id="rId20">
+      <w:hyperlink r:id="rId21">
         <w:r>
           <w:t xml:space="preserve"> </w:t>
         </w:r>
       </w:hyperlink>
-      <w:hyperlink r:id="rId21">
+      <w:hyperlink r:id="rId22">
         <w:r>
           <w:rPr>
             <w:rStyle w:val="Hyperlink"/>
@@ -8613,12 +8874,12 @@
       <w:r>
         <w:t>. Disponível em:</w:t>
       </w:r>
-      <w:hyperlink r:id="rId22">
+      <w:hyperlink r:id="rId23">
         <w:r>
           <w:t xml:space="preserve"> </w:t>
         </w:r>
       </w:hyperlink>
-      <w:hyperlink r:id="rId23">
+      <w:hyperlink r:id="rId24">
         <w:r>
           <w:rPr>
             <w:rStyle w:val="Hyperlink"/>
@@ -8652,12 +8913,12 @@
       <w:r>
         <w:t>. Disponível em:</w:t>
       </w:r>
-      <w:hyperlink r:id="rId24">
+      <w:hyperlink r:id="rId25">
         <w:r>
           <w:t xml:space="preserve"> </w:t>
         </w:r>
       </w:hyperlink>
-      <w:hyperlink r:id="rId25">
+      <w:hyperlink r:id="rId26">
         <w:r>
           <w:rPr>
             <w:rStyle w:val="Hyperlink"/>
@@ -8691,12 +8952,12 @@
       <w:r>
         <w:t>. Disponível em:</w:t>
       </w:r>
-      <w:hyperlink r:id="rId26">
+      <w:hyperlink r:id="rId27">
         <w:r>
           <w:t xml:space="preserve"> </w:t>
         </w:r>
       </w:hyperlink>
-      <w:hyperlink r:id="rId27">
+      <w:hyperlink r:id="rId28">
         <w:r>
           <w:rPr>
             <w:rStyle w:val="Hyperlink"/>
@@ -8730,12 +8991,12 @@
       <w:r>
         <w:t>. Disponível em:</w:t>
       </w:r>
-      <w:hyperlink r:id="rId28">
+      <w:hyperlink r:id="rId29">
         <w:r>
           <w:t xml:space="preserve"> </w:t>
         </w:r>
       </w:hyperlink>
-      <w:hyperlink r:id="rId29">
+      <w:hyperlink r:id="rId30">
         <w:r>
           <w:rPr>
             <w:rStyle w:val="Hyperlink"/>
@@ -8769,12 +9030,12 @@
       <w:r>
         <w:t>. Disponível em:</w:t>
       </w:r>
-      <w:hyperlink r:id="rId30">
+      <w:hyperlink r:id="rId31">
         <w:r>
           <w:t xml:space="preserve"> </w:t>
         </w:r>
       </w:hyperlink>
-      <w:hyperlink r:id="rId31">
+      <w:hyperlink r:id="rId32">
         <w:r>
           <w:rPr>
             <w:rStyle w:val="Hyperlink"/>
@@ -8808,12 +9069,12 @@
       <w:r>
         <w:t>. Disponível em:</w:t>
       </w:r>
-      <w:hyperlink r:id="rId32">
+      <w:hyperlink r:id="rId33">
         <w:r>
           <w:t xml:space="preserve"> </w:t>
         </w:r>
       </w:hyperlink>
-      <w:hyperlink r:id="rId33">
+      <w:hyperlink r:id="rId34">
         <w:r>
           <w:rPr>
             <w:rStyle w:val="Hyperlink"/>
@@ -8847,12 +9108,12 @@
       <w:r>
         <w:t>. Código Brasileiro de Aeronáutica. Disponível em:</w:t>
       </w:r>
-      <w:hyperlink r:id="rId34">
+      <w:hyperlink r:id="rId35">
         <w:r>
           <w:t xml:space="preserve"> </w:t>
         </w:r>
       </w:hyperlink>
-      <w:hyperlink r:id="rId35">
+      <w:hyperlink r:id="rId36">
         <w:r>
           <w:rPr>
             <w:rStyle w:val="Hyperlink"/>
@@ -8911,12 +9172,12 @@
       <w:r>
         <w:t>. Disponível em:</w:t>
       </w:r>
-      <w:hyperlink r:id="rId36">
+      <w:hyperlink r:id="rId37">
         <w:r>
           <w:t xml:space="preserve"> </w:t>
         </w:r>
       </w:hyperlink>
-      <w:hyperlink r:id="rId37">
+      <w:hyperlink r:id="rId38">
         <w:r>
           <w:rPr>
             <w:rStyle w:val="Hyperlink"/>
@@ -8956,12 +9217,12 @@
       <w:r>
         <w:t>. Disponível em:</w:t>
       </w:r>
-      <w:hyperlink r:id="rId38">
+      <w:hyperlink r:id="rId39">
         <w:r>
           <w:t xml:space="preserve"> </w:t>
         </w:r>
       </w:hyperlink>
-      <w:hyperlink r:id="rId39">
+      <w:hyperlink r:id="rId40">
         <w:r>
           <w:rPr>
             <w:rStyle w:val="Hyperlink"/>
@@ -8995,12 +9256,12 @@
       <w:r>
         <w:t>. Disponível em:</w:t>
       </w:r>
-      <w:hyperlink r:id="rId40">
+      <w:hyperlink r:id="rId41">
         <w:r>
           <w:t xml:space="preserve"> </w:t>
         </w:r>
       </w:hyperlink>
-      <w:hyperlink r:id="rId41">
+      <w:hyperlink r:id="rId42">
         <w:r>
           <w:rPr>
             <w:rStyle w:val="Hyperlink"/>
@@ -9048,12 +9309,12 @@
       <w:r>
         <w:t>Disponível em:</w:t>
       </w:r>
-      <w:hyperlink r:id="rId42">
+      <w:hyperlink r:id="rId43">
         <w:r>
           <w:t xml:space="preserve"> </w:t>
         </w:r>
       </w:hyperlink>
-      <w:hyperlink r:id="rId43">
+      <w:hyperlink r:id="rId44">
         <w:r>
           <w:rPr>
             <w:rStyle w:val="Hyperlink"/>
@@ -9095,7 +9356,7 @@
         </w:rPr>
         <w:t xml:space="preserve">. Disponível em: </w:t>
       </w:r>
-      <w:hyperlink r:id="rId44">
+      <w:hyperlink r:id="rId45">
         <w:r>
           <w:rPr>
             <w:rStyle w:val="Hyperlink"/>
@@ -9135,7 +9396,7 @@
         </w:rPr>
         <w:t xml:space="preserve">. Glossário. Disponível em: </w:t>
       </w:r>
-      <w:hyperlink r:id="rId45">
+      <w:hyperlink r:id="rId46">
         <w:r>
           <w:rPr>
             <w:rStyle w:val="Hyperlink"/>
@@ -9175,7 +9436,7 @@
         </w:rPr>
         <w:t xml:space="preserve">. Glossário. Disponível em: </w:t>
       </w:r>
-      <w:hyperlink r:id="rId46">
+      <w:hyperlink r:id="rId47">
         <w:r>
           <w:rPr>
             <w:rStyle w:val="Hyperlink"/>
@@ -9201,7 +9462,7 @@
         </w:rPr>
         <w:t xml:space="preserve">DECEA – DEPARTAMENTO DE CONTROLE DO ESPAÇO AÉREO. Disponível em: </w:t>
       </w:r>
-      <w:hyperlink r:id="rId47">
+      <w:hyperlink r:id="rId48">
         <w:r>
           <w:rPr>
             <w:rStyle w:val="Hyperlink"/>
@@ -9227,7 +9488,7 @@
         </w:rPr>
         <w:t xml:space="preserve">DECEA – DEPARTAMENTO DE CONTROLE DO ESPAÇO AÉREO. Disponível em: </w:t>
       </w:r>
-      <w:hyperlink r:id="rId48">
+      <w:hyperlink r:id="rId49">
         <w:r>
           <w:rPr>
             <w:rStyle w:val="Hyperlink"/>
@@ -9267,7 +9528,7 @@
         </w:rPr>
         <w:t xml:space="preserve">. Disponível em: </w:t>
       </w:r>
-      <w:hyperlink r:id="rId49">
+      <w:hyperlink r:id="rId50">
         <w:r>
           <w:rPr>
             <w:rStyle w:val="Hyperlink"/>
@@ -9291,7 +9552,7 @@
       </w:pPr>
     </w:p>
     <w:sectPr>
-      <w:headerReference w:type="default" r:id="rId50"/>
+      <w:headerReference w:type="default" r:id="rId51"/>
       <w:pgSz w:w="11906" w:h="16838"/>
       <w:pgMar w:top="1701" w:right="1134" w:bottom="1134" w:left="1701" w:header="709" w:footer="709" w:gutter="0"/>
       <w:cols w:space="708"/>

</xml_diff>

<commit_message>
Adição de artefato Diagrama de Sequência
</commit_message>
<xml_diff>
--- a/Contexto/Horus Monitoring v3.docx
+++ b/Contexto/Horus Monitoring v3.docx
@@ -2626,7 +2626,7 @@
           <w:noProof/>
         </w:rPr>
         <w:drawing>
-          <wp:inline distT="0" distB="0" distL="0" distR="0" wp14:anchorId="79D53042" wp14:editId="147C024D">
+          <wp:inline distT="0" distB="0" distL="0" distR="0" wp14:anchorId="79D53042" wp14:editId="6C6AB3C7">
             <wp:extent cx="5534660" cy="3825875"/>
             <wp:effectExtent l="0" t="0" r="8890" b="3175"/>
             <wp:docPr id="417717608" name="Imagem 5"/>
@@ -4007,7 +4007,7 @@
               </wp:anchor>
             </w:drawing>
           </mc:Choice>
-          <mc:Fallback xmlns:arto="http://schemas.microsoft.com/office/word/2006/arto" xmlns:a="http://schemas.openxmlformats.org/drawingml/2006/main" xmlns:pic="http://schemas.openxmlformats.org/drawingml/2006/picture" xmlns:a14="http://schemas.microsoft.com/office/drawing/2010/main">
+          <mc:Fallback xmlns:a14="http://schemas.microsoft.com/office/drawing/2010/main" xmlns:pic="http://schemas.openxmlformats.org/drawingml/2006/picture" xmlns:a="http://schemas.openxmlformats.org/drawingml/2006/main" xmlns:arto="http://schemas.microsoft.com/office/word/2006/arto">
             <w:pict>
               <v:rect id="Retângulo 7" style="position:absolute;margin-left:311.75pt;margin-top:75.6pt;width:99.2pt;height:19.85pt;z-index:251661312;visibility:visible;mso-wrap-style:square;mso-width-percent:0;mso-height-percent:0;mso-wrap-distance-left:9pt;mso-wrap-distance-top:0;mso-wrap-distance-right:9pt;mso-wrap-distance-bottom:0;mso-position-horizontal:absolute;mso-position-horizontal-relative:text;mso-position-vertical:absolute;mso-position-vertical-relative:text;mso-width-percent:0;mso-height-percent:0;mso-width-relative:margin;mso-height-relative:margin;v-text-anchor:middle" o:spid="_x0000_s1026" fillcolor="#45b0e1 [1940]" stroked="f" strokeweight="1.5pt" w14:anchorId="07B4DEAF" o:gfxdata="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">
                 <v:fill opacity="32896f"/>
@@ -4087,7 +4087,7 @@
               </wp:anchor>
             </w:drawing>
           </mc:Choice>
-          <mc:Fallback xmlns:arto="http://schemas.microsoft.com/office/word/2006/arto" xmlns:a="http://schemas.openxmlformats.org/drawingml/2006/main" xmlns:pic="http://schemas.openxmlformats.org/drawingml/2006/picture" xmlns:a14="http://schemas.microsoft.com/office/drawing/2010/main">
+          <mc:Fallback xmlns:a14="http://schemas.microsoft.com/office/drawing/2010/main" xmlns:pic="http://schemas.openxmlformats.org/drawingml/2006/picture" xmlns:a="http://schemas.openxmlformats.org/drawingml/2006/main" xmlns:arto="http://schemas.microsoft.com/office/word/2006/arto">
             <w:pict>
               <v:rect id="Retângulo 7" style="position:absolute;margin-left:141.25pt;margin-top:63pt;width:108.45pt;height:16.85pt;z-index:251659264;visibility:visible;mso-wrap-style:square;mso-wrap-distance-left:9pt;mso-wrap-distance-top:0;mso-wrap-distance-right:9pt;mso-wrap-distance-bottom:0;mso-position-horizontal:absolute;mso-position-horizontal-relative:text;mso-position-vertical:absolute;mso-position-vertical-relative:text;v-text-anchor:middle" o:spid="_x0000_s1026" fillcolor="#45b0e1 [1940]" stroked="f" strokeweight="1.5pt" w14:anchorId="070A92C7" o:gfxdata="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">
                 <v:fill opacity="32896f"/>
@@ -8444,9 +8444,6 @@
     <w:p>
       <w:pPr>
         <w:pStyle w:val="Ttulo"/>
-        <w:rPr>
-          <w:highlight w:val="white"/>
-        </w:rPr>
       </w:pPr>
       <w:bookmarkStart w:id="44" w:name="_Toc230628533"/>
       <w:r>
@@ -8460,6 +8457,61 @@
         <w:t xml:space="preserve"> DE SEQUÊNCIA</w:t>
       </w:r>
       <w:bookmarkEnd w:id="44"/>
+    </w:p>
+    <w:p>
+      <w:pPr>
+        <w:pStyle w:val="Ttulo"/>
+        <w:jc w:val="center"/>
+        <w:rPr>
+          <w:highlight w:val="white"/>
+        </w:rPr>
+      </w:pPr>
+      <w:r>
+        <w:rPr>
+          <w:noProof/>
+        </w:rPr>
+        <w:drawing>
+          <wp:inline distT="0" distB="0" distL="0" distR="0" wp14:anchorId="58ADD1EC" wp14:editId="16DB0C11">
+            <wp:extent cx="5645888" cy="5830567"/>
+            <wp:effectExtent l="0" t="0" r="0" b="0"/>
+            <wp:docPr id="836124422" name="Imagem 3"/>
+            <wp:cNvGraphicFramePr>
+              <a:graphicFrameLocks xmlns:a="http://schemas.openxmlformats.org/drawingml/2006/main" noChangeAspect="1"/>
+            </wp:cNvGraphicFramePr>
+            <a:graphic xmlns:a="http://schemas.openxmlformats.org/drawingml/2006/main">
+              <a:graphicData uri="http://schemas.openxmlformats.org/drawingml/2006/picture">
+                <pic:pic xmlns:pic="http://schemas.openxmlformats.org/drawingml/2006/picture">
+                  <pic:nvPicPr>
+                    <pic:cNvPr id="836124422" name="Imagem 836124422"/>
+                    <pic:cNvPicPr/>
+                  </pic:nvPicPr>
+                  <pic:blipFill>
+                    <a:blip r:embed="rId14">
+                      <a:extLst>
+                        <a:ext uri="{28A0092B-C50C-407E-A947-70E740481C1C}">
+                          <a14:useLocalDpi xmlns:a14="http://schemas.microsoft.com/office/drawing/2010/main" val="0"/>
+                        </a:ext>
+                      </a:extLst>
+                    </a:blip>
+                    <a:stretch>
+                      <a:fillRect/>
+                    </a:stretch>
+                  </pic:blipFill>
+                  <pic:spPr>
+                    <a:xfrm>
+                      <a:off x="0" y="0"/>
+                      <a:ext cx="5667990" cy="5853392"/>
+                    </a:xfrm>
+                    <a:prstGeom prst="rect">
+                      <a:avLst/>
+                    </a:prstGeom>
+                  </pic:spPr>
+                </pic:pic>
+              </a:graphicData>
+            </a:graphic>
+          </wp:inline>
+        </w:drawing>
+      </w:r>
       <w:r>
         <w:rPr>
           <w:highlight w:val="white"/>
@@ -8514,12 +8566,12 @@
       <w:r>
         <w:t>. Disponível em:</w:t>
       </w:r>
-      <w:hyperlink r:id="rId14">
+      <w:hyperlink r:id="rId15">
         <w:r>
           <w:t xml:space="preserve"> </w:t>
         </w:r>
       </w:hyperlink>
-      <w:hyperlink r:id="rId15">
+      <w:hyperlink r:id="rId16">
         <w:r>
           <w:rPr>
             <w:rStyle w:val="Hyperlink"/>
@@ -8575,118 +8627,118 @@
       <w:r>
         <w:t>. Disponível em:</w:t>
       </w:r>
-      <w:hyperlink r:id="rId16">
-        <w:r>
-          <w:t xml:space="preserve"> </w:t>
-        </w:r>
-      </w:hyperlink>
-      <w:r>
-        <w:rPr>
-          <w:rStyle w:val="Hyperlink"/>
-        </w:rPr>
-        <w:t>https://www.gov.br/portos-e-aeroportos/pt-br/assuntos/noticias/2025/07/transporte-aereo-impulsiona-faturamento-recorde-de-r-17-bilhoes-do-turismo-brasileiro</w:t>
-      </w:r>
-      <w:r>
-        <w:t xml:space="preserve">. </w:t>
-      </w:r>
-      <w:proofErr w:type="spellStart"/>
-      <w:r>
-        <w:rPr>
-          <w:lang w:val="en-US"/>
-        </w:rPr>
-        <w:t>Acesso</w:t>
-      </w:r>
-      <w:proofErr w:type="spellEnd"/>
-      <w:r>
-        <w:rPr>
-          <w:lang w:val="en-US"/>
-        </w:rPr>
-        <w:t xml:space="preserve"> </w:t>
-      </w:r>
-      <w:proofErr w:type="spellStart"/>
-      <w:r>
-        <w:rPr>
-          <w:lang w:val="en-US"/>
-        </w:rPr>
-        <w:t>em</w:t>
-      </w:r>
-      <w:proofErr w:type="spellEnd"/>
-      <w:r>
-        <w:rPr>
-          <w:lang w:val="en-US"/>
-        </w:rPr>
-        <w:t xml:space="preserve">: 24 </w:t>
-      </w:r>
-      <w:proofErr w:type="gramStart"/>
-      <w:r>
-        <w:rPr>
-          <w:lang w:val="en-US"/>
-        </w:rPr>
-        <w:t>mar</w:t>
-      </w:r>
-      <w:proofErr w:type="gramEnd"/>
-      <w:r>
-        <w:rPr>
-          <w:lang w:val="en-US"/>
-        </w:rPr>
-        <w:t>. 2026.</w:t>
-      </w:r>
-    </w:p>
-    <w:p>
-      <w:pPr>
-        <w:spacing w:line="240" w:lineRule="auto"/>
-        <w:rPr>
-          <w:lang w:val="en-US"/>
-        </w:rPr>
-      </w:pPr>
-    </w:p>
-    <w:p>
-      <w:pPr>
-        <w:spacing w:line="240" w:lineRule="auto"/>
-      </w:pPr>
-      <w:r>
-        <w:rPr>
-          <w:lang w:val="en-US"/>
-        </w:rPr>
-        <w:t xml:space="preserve">AIRPORT INFORMATION SYSTEMS. </w:t>
-      </w:r>
-      <w:r>
-        <w:rPr>
-          <w:b/>
-          <w:bCs/>
-          <w:lang w:val="en-US"/>
-        </w:rPr>
-        <w:t>ATC and air traffic control admin system</w:t>
-      </w:r>
-      <w:r>
-        <w:rPr>
-          <w:b/>
-          <w:bCs/>
-          <w:lang w:val="en-US"/>
-        </w:rPr>
-        <w:t xml:space="preserve"> </w:t>
-      </w:r>
-      <w:r>
-        <w:rPr>
-          <w:lang w:val="en-US"/>
-        </w:rPr>
-        <w:t>2023</w:t>
-      </w:r>
-      <w:r>
-        <w:rPr>
-          <w:lang w:val="en-US"/>
-        </w:rPr>
-        <w:t xml:space="preserve">. </w:t>
-      </w:r>
-      <w:r>
-        <w:t>Disponível em:</w:t>
-      </w:r>
       <w:hyperlink r:id="rId17">
         <w:r>
           <w:t xml:space="preserve"> </w:t>
         </w:r>
       </w:hyperlink>
+      <w:r>
+        <w:rPr>
+          <w:rStyle w:val="Hyperlink"/>
+        </w:rPr>
+        <w:t>https://www.gov.br/portos-e-aeroportos/pt-br/assuntos/noticias/2025/07/transporte-aereo-impulsiona-faturamento-recorde-de-r-17-bilhoes-do-turismo-brasileiro</w:t>
+      </w:r>
+      <w:r>
+        <w:t xml:space="preserve">. </w:t>
+      </w:r>
+      <w:proofErr w:type="spellStart"/>
+      <w:r>
+        <w:rPr>
+          <w:lang w:val="en-US"/>
+        </w:rPr>
+        <w:t>Acesso</w:t>
+      </w:r>
+      <w:proofErr w:type="spellEnd"/>
+      <w:r>
+        <w:rPr>
+          <w:lang w:val="en-US"/>
+        </w:rPr>
+        <w:t xml:space="preserve"> </w:t>
+      </w:r>
+      <w:proofErr w:type="spellStart"/>
+      <w:r>
+        <w:rPr>
+          <w:lang w:val="en-US"/>
+        </w:rPr>
+        <w:t>em</w:t>
+      </w:r>
+      <w:proofErr w:type="spellEnd"/>
+      <w:r>
+        <w:rPr>
+          <w:lang w:val="en-US"/>
+        </w:rPr>
+        <w:t xml:space="preserve">: 24 </w:t>
+      </w:r>
+      <w:proofErr w:type="gramStart"/>
+      <w:r>
+        <w:rPr>
+          <w:lang w:val="en-US"/>
+        </w:rPr>
+        <w:t>mar</w:t>
+      </w:r>
+      <w:proofErr w:type="gramEnd"/>
+      <w:r>
+        <w:rPr>
+          <w:lang w:val="en-US"/>
+        </w:rPr>
+        <w:t>. 2026.</w:t>
+      </w:r>
+    </w:p>
+    <w:p>
+      <w:pPr>
+        <w:spacing w:line="240" w:lineRule="auto"/>
+        <w:rPr>
+          <w:lang w:val="en-US"/>
+        </w:rPr>
+      </w:pPr>
+    </w:p>
+    <w:p>
+      <w:pPr>
+        <w:spacing w:line="240" w:lineRule="auto"/>
+      </w:pPr>
+      <w:r>
+        <w:rPr>
+          <w:lang w:val="en-US"/>
+        </w:rPr>
+        <w:t xml:space="preserve">AIRPORT INFORMATION SYSTEMS. </w:t>
+      </w:r>
+      <w:r>
+        <w:rPr>
+          <w:b/>
+          <w:bCs/>
+          <w:lang w:val="en-US"/>
+        </w:rPr>
+        <w:t>ATC and air traffic control admin system</w:t>
+      </w:r>
+      <w:r>
+        <w:rPr>
+          <w:b/>
+          <w:bCs/>
+          <w:lang w:val="en-US"/>
+        </w:rPr>
+        <w:t xml:space="preserve"> </w:t>
+      </w:r>
+      <w:r>
+        <w:rPr>
+          <w:lang w:val="en-US"/>
+        </w:rPr>
+        <w:t>2023</w:t>
+      </w:r>
+      <w:r>
+        <w:rPr>
+          <w:lang w:val="en-US"/>
+        </w:rPr>
+        <w:t xml:space="preserve">. </w:t>
+      </w:r>
+      <w:r>
+        <w:t>Disponível em:</w:t>
+      </w:r>
       <w:hyperlink r:id="rId18">
+        <w:r>
+          <w:t xml:space="preserve"> </w:t>
+        </w:r>
+      </w:hyperlink>
+      <w:hyperlink r:id="rId19">
         <w:r>
           <w:rPr>
             <w:rStyle w:val="Hyperlink"/>
@@ -8770,12 +8822,12 @@
       <w:r>
         <w:t>. Disponível em:</w:t>
       </w:r>
-      <w:hyperlink r:id="rId19">
+      <w:hyperlink r:id="rId20">
         <w:r>
           <w:t xml:space="preserve"> </w:t>
         </w:r>
       </w:hyperlink>
-      <w:hyperlink r:id="rId20">
+      <w:hyperlink r:id="rId21">
         <w:r>
           <w:rPr>
             <w:rStyle w:val="Hyperlink"/>
@@ -8828,12 +8880,12 @@
       <w:r>
         <w:t>. Disponível em:</w:t>
       </w:r>
-      <w:hyperlink r:id="rId21">
+      <w:hyperlink r:id="rId22">
         <w:r>
           <w:t xml:space="preserve"> </w:t>
         </w:r>
       </w:hyperlink>
-      <w:hyperlink r:id="rId22">
+      <w:hyperlink r:id="rId23">
         <w:r>
           <w:rPr>
             <w:rStyle w:val="Hyperlink"/>
@@ -8874,12 +8926,12 @@
       <w:r>
         <w:t>. Disponível em:</w:t>
       </w:r>
-      <w:hyperlink r:id="rId23">
+      <w:hyperlink r:id="rId24">
         <w:r>
           <w:t xml:space="preserve"> </w:t>
         </w:r>
       </w:hyperlink>
-      <w:hyperlink r:id="rId24">
+      <w:hyperlink r:id="rId25">
         <w:r>
           <w:rPr>
             <w:rStyle w:val="Hyperlink"/>
@@ -8913,12 +8965,12 @@
       <w:r>
         <w:t>. Disponível em:</w:t>
       </w:r>
-      <w:hyperlink r:id="rId25">
+      <w:hyperlink r:id="rId26">
         <w:r>
           <w:t xml:space="preserve"> </w:t>
         </w:r>
       </w:hyperlink>
-      <w:hyperlink r:id="rId26">
+      <w:hyperlink r:id="rId27">
         <w:r>
           <w:rPr>
             <w:rStyle w:val="Hyperlink"/>
@@ -8952,12 +9004,12 @@
       <w:r>
         <w:t>. Disponível em:</w:t>
       </w:r>
-      <w:hyperlink r:id="rId27">
+      <w:hyperlink r:id="rId28">
         <w:r>
           <w:t xml:space="preserve"> </w:t>
         </w:r>
       </w:hyperlink>
-      <w:hyperlink r:id="rId28">
+      <w:hyperlink r:id="rId29">
         <w:r>
           <w:rPr>
             <w:rStyle w:val="Hyperlink"/>
@@ -8991,12 +9043,12 @@
       <w:r>
         <w:t>. Disponível em:</w:t>
       </w:r>
-      <w:hyperlink r:id="rId29">
+      <w:hyperlink r:id="rId30">
         <w:r>
           <w:t xml:space="preserve"> </w:t>
         </w:r>
       </w:hyperlink>
-      <w:hyperlink r:id="rId30">
+      <w:hyperlink r:id="rId31">
         <w:r>
           <w:rPr>
             <w:rStyle w:val="Hyperlink"/>
@@ -9030,12 +9082,12 @@
       <w:r>
         <w:t>. Disponível em:</w:t>
       </w:r>
-      <w:hyperlink r:id="rId31">
+      <w:hyperlink r:id="rId32">
         <w:r>
           <w:t xml:space="preserve"> </w:t>
         </w:r>
       </w:hyperlink>
-      <w:hyperlink r:id="rId32">
+      <w:hyperlink r:id="rId33">
         <w:r>
           <w:rPr>
             <w:rStyle w:val="Hyperlink"/>
@@ -9069,12 +9121,12 @@
       <w:r>
         <w:t>. Disponível em:</w:t>
       </w:r>
-      <w:hyperlink r:id="rId33">
+      <w:hyperlink r:id="rId34">
         <w:r>
           <w:t xml:space="preserve"> </w:t>
         </w:r>
       </w:hyperlink>
-      <w:hyperlink r:id="rId34">
+      <w:hyperlink r:id="rId35">
         <w:r>
           <w:rPr>
             <w:rStyle w:val="Hyperlink"/>
@@ -9108,12 +9160,12 @@
       <w:r>
         <w:t>. Código Brasileiro de Aeronáutica. Disponível em:</w:t>
       </w:r>
-      <w:hyperlink r:id="rId35">
+      <w:hyperlink r:id="rId36">
         <w:r>
           <w:t xml:space="preserve"> </w:t>
         </w:r>
       </w:hyperlink>
-      <w:hyperlink r:id="rId36">
+      <w:hyperlink r:id="rId37">
         <w:r>
           <w:rPr>
             <w:rStyle w:val="Hyperlink"/>
@@ -9172,12 +9224,12 @@
       <w:r>
         <w:t>. Disponível em:</w:t>
       </w:r>
-      <w:hyperlink r:id="rId37">
+      <w:hyperlink r:id="rId38">
         <w:r>
           <w:t xml:space="preserve"> </w:t>
         </w:r>
       </w:hyperlink>
-      <w:hyperlink r:id="rId38">
+      <w:hyperlink r:id="rId39">
         <w:r>
           <w:rPr>
             <w:rStyle w:val="Hyperlink"/>
@@ -9217,12 +9269,12 @@
       <w:r>
         <w:t>. Disponível em:</w:t>
       </w:r>
-      <w:hyperlink r:id="rId39">
+      <w:hyperlink r:id="rId40">
         <w:r>
           <w:t xml:space="preserve"> </w:t>
         </w:r>
       </w:hyperlink>
-      <w:hyperlink r:id="rId40">
+      <w:hyperlink r:id="rId41">
         <w:r>
           <w:rPr>
             <w:rStyle w:val="Hyperlink"/>
@@ -9256,12 +9308,12 @@
       <w:r>
         <w:t>. Disponível em:</w:t>
       </w:r>
-      <w:hyperlink r:id="rId41">
+      <w:hyperlink r:id="rId42">
         <w:r>
           <w:t xml:space="preserve"> </w:t>
         </w:r>
       </w:hyperlink>
-      <w:hyperlink r:id="rId42">
+      <w:hyperlink r:id="rId43">
         <w:r>
           <w:rPr>
             <w:rStyle w:val="Hyperlink"/>
@@ -9309,12 +9361,12 @@
       <w:r>
         <w:t>Disponível em:</w:t>
       </w:r>
-      <w:hyperlink r:id="rId43">
+      <w:hyperlink r:id="rId44">
         <w:r>
           <w:t xml:space="preserve"> </w:t>
         </w:r>
       </w:hyperlink>
-      <w:hyperlink r:id="rId44">
+      <w:hyperlink r:id="rId45">
         <w:r>
           <w:rPr>
             <w:rStyle w:val="Hyperlink"/>
@@ -9356,7 +9408,7 @@
         </w:rPr>
         <w:t xml:space="preserve">. Disponível em: </w:t>
       </w:r>
-      <w:hyperlink r:id="rId45">
+      <w:hyperlink r:id="rId46">
         <w:r>
           <w:rPr>
             <w:rStyle w:val="Hyperlink"/>
@@ -9396,7 +9448,7 @@
         </w:rPr>
         <w:t xml:space="preserve">. Glossário. Disponível em: </w:t>
       </w:r>
-      <w:hyperlink r:id="rId46">
+      <w:hyperlink r:id="rId47">
         <w:r>
           <w:rPr>
             <w:rStyle w:val="Hyperlink"/>
@@ -9436,7 +9488,7 @@
         </w:rPr>
         <w:t xml:space="preserve">. Glossário. Disponível em: </w:t>
       </w:r>
-      <w:hyperlink r:id="rId47">
+      <w:hyperlink r:id="rId48">
         <w:r>
           <w:rPr>
             <w:rStyle w:val="Hyperlink"/>
@@ -9462,7 +9514,7 @@
         </w:rPr>
         <w:t xml:space="preserve">DECEA – DEPARTAMENTO DE CONTROLE DO ESPAÇO AÉREO. Disponível em: </w:t>
       </w:r>
-      <w:hyperlink r:id="rId48">
+      <w:hyperlink r:id="rId49">
         <w:r>
           <w:rPr>
             <w:rStyle w:val="Hyperlink"/>
@@ -9488,7 +9540,7 @@
         </w:rPr>
         <w:t xml:space="preserve">DECEA – DEPARTAMENTO DE CONTROLE DO ESPAÇO AÉREO. Disponível em: </w:t>
       </w:r>
-      <w:hyperlink r:id="rId49">
+      <w:hyperlink r:id="rId50">
         <w:r>
           <w:rPr>
             <w:rStyle w:val="Hyperlink"/>
@@ -9528,7 +9580,7 @@
         </w:rPr>
         <w:t xml:space="preserve">. Disponível em: </w:t>
       </w:r>
-      <w:hyperlink r:id="rId50">
+      <w:hyperlink r:id="rId51">
         <w:r>
           <w:rPr>
             <w:rStyle w:val="Hyperlink"/>
@@ -9552,7 +9604,7 @@
       </w:pPr>
     </w:p>
     <w:sectPr>
-      <w:headerReference w:type="default" r:id="rId51"/>
+      <w:headerReference w:type="default" r:id="rId52"/>
       <w:pgSz w:w="11906" w:h="16838"/>
       <w:pgMar w:top="1701" w:right="1134" w:bottom="1134" w:left="1701" w:header="709" w:footer="709" w:gutter="0"/>
       <w:cols w:space="708"/>

</xml_diff>